<commit_message>
Initial PG Management CLI project structure
- Added model classes
- Added service classes
- Added menu classes
- Added util classes
- Added MainApp
</commit_message>
<xml_diff>
--- a/Requirements/Addon/PG_Management_CLI_Input_Output.docx
+++ b/Requirements/Addon/PG_Management_CLI_Input_Output.docx
@@ -90,828 +90,834 @@
       </w:r>
     </w:p>
     <w:p/>
-    <w:p>
-      <w:r>
-        <w:t>====================================</w:t>
-      </w:r>
-    </w:p>
-    <w:p>
-      <w:r>
-        <w:t xml:space="preserve">        PG MANAGEMENT SYSTEM</w:t>
-      </w:r>
-    </w:p>
-    <w:p>
-      <w:r>
-        <w:t>====================================</w:t>
-      </w:r>
-    </w:p>
-    <w:p/>
-    <w:p>
-      <w:r>
-        <w:t>1. Tenant Registration</w:t>
-      </w:r>
-    </w:p>
-    <w:p>
-      <w:r>
-        <w:t>2. Tenant Login</w:t>
-      </w:r>
-    </w:p>
-    <w:p>
-      <w:r>
-        <w:lastRenderedPageBreak/>
-        <w:t>3. Admin Login</w:t>
-      </w:r>
-    </w:p>
-    <w:p>
-      <w:r>
-        <w:t>4. Exit</w:t>
-      </w:r>
-    </w:p>
-    <w:p/>
-    <w:p>
-      <w:r>
-        <w:t>Enter your choice: 2</w:t>
-      </w:r>
-    </w:p>
-    <w:p/>
-    <w:p>
-      <w:r>
-        <w:t>----- Tenant Login -----</w:t>
-      </w:r>
-    </w:p>
-    <w:p>
-      <w:r>
-        <w:t>Enter Email: rahul@gmail.com</w:t>
-      </w:r>
-    </w:p>
-    <w:p>
-      <w:r>
-        <w:t>Enter Password: rahul123</w:t>
-      </w:r>
-    </w:p>
-    <w:p/>
-    <w:p>
-      <w:r>
-        <w:t>Login successful.</w:t>
-      </w:r>
-    </w:p>
-    <w:p>
-      <w:r>
-        <w:t>Welcome Rahul</w:t>
-      </w:r>
-    </w:p>
-    <w:p/>
-    <w:p>
-      <w:r>
-        <w:t>----------- Tenant Dashboard -----------</w:t>
-      </w:r>
-    </w:p>
-    <w:p/>
-    <w:p>
-      <w:r>
-        <w:t>1. View Profile</w:t>
-      </w:r>
-    </w:p>
-    <w:p>
-      <w:r>
-        <w:t>2. Update Profile</w:t>
-      </w:r>
-    </w:p>
-    <w:p>
-      <w:r>
-        <w:t>3. View Available Rooms</w:t>
-      </w:r>
-    </w:p>
-    <w:p>
-      <w:r>
-        <w:t>4. Book Room</w:t>
-      </w:r>
-    </w:p>
-    <w:p>
-      <w:r>
-        <w:t>5. View Booking Details</w:t>
-      </w:r>
-    </w:p>
-    <w:p>
-      <w:r>
-        <w:t>6. Cancel Booking</w:t>
-      </w:r>
-    </w:p>
-    <w:p>
-      <w:r>
-        <w:t>7. Make Payment</w:t>
-      </w:r>
-    </w:p>
-    <w:p>
-      <w:r>
-        <w:t>8. Send Message to Admin</w:t>
-      </w:r>
-    </w:p>
-    <w:p>
-      <w:r>
-        <w:t>9. View Messages</w:t>
-      </w:r>
-    </w:p>
-    <w:p>
-      <w:r>
-        <w:t>10. Logout</w:t>
-      </w:r>
-    </w:p>
-    <w:p/>
-    <w:p>
-      <w:r>
-        <w:t>Enter your choice: 1</w:t>
-      </w:r>
-    </w:p>
-    <w:p/>
-    <w:p>
-      <w:r>
-        <w:t>----- Tenant Profile -----</w:t>
-      </w:r>
-    </w:p>
-    <w:p>
-      <w:r>
-        <w:t>Name: Rahul</w:t>
-      </w:r>
-    </w:p>
-    <w:p>
-      <w:r>
-        <w:t>Email: rahul@gmail.com</w:t>
-      </w:r>
-    </w:p>
-    <w:p>
-      <w:r>
-        <w:t>Phone: 9876543210</w:t>
-      </w:r>
-    </w:p>
     <w:p/>
     <w:p/>
-    <w:p>
-      <w:r>
-        <w:t>Enter your choice: 2</w:t>
-      </w:r>
-    </w:p>
-    <w:p/>
-    <w:p>
-      <w:r>
-        <w:t>----- Update Profile -----</w:t>
-      </w:r>
-    </w:p>
-    <w:p>
-      <w:r>
-        <w:t>Enter new phone number: 9999999999</w:t>
-      </w:r>
-    </w:p>
-    <w:p>
-      <w:r>
-        <w:t>Enter new password: rahul456</w:t>
-      </w:r>
-    </w:p>
-    <w:p/>
-    <w:p>
-      <w:r>
-        <w:t>Profile updated successfully.</w:t>
-      </w:r>
-    </w:p>
     <w:p/>
     <w:p/>
-    <w:p>
-      <w:r>
-        <w:t>Enter your choice: 3</w:t>
-      </w:r>
-    </w:p>
-    <w:p/>
-    <w:p>
-      <w:r>
-        <w:t>----- Available Rooms -----</w:t>
-      </w:r>
-    </w:p>
-    <w:p/>
-    <w:p>
-      <w:r>
-        <w:t>Room ID: 101</w:t>
-      </w:r>
-    </w:p>
-    <w:p>
-      <w:r>
-        <w:t>Room Type: Single</w:t>
-      </w:r>
-    </w:p>
-    <w:p>
-      <w:r>
-        <w:t>Rent: 5000</w:t>
-      </w:r>
-    </w:p>
-    <w:p>
-      <w:r>
-        <w:t>Status: Available</w:t>
-      </w:r>
-    </w:p>
-    <w:p/>
-    <w:p>
-      <w:r>
-        <w:t>Room ID: 102</w:t>
-      </w:r>
-    </w:p>
-    <w:p>
-      <w:r>
-        <w:lastRenderedPageBreak/>
-        <w:t>Room Type: Double</w:t>
-      </w:r>
-    </w:p>
-    <w:p>
-      <w:r>
-        <w:t>Rent: 3500</w:t>
-      </w:r>
-    </w:p>
-    <w:p>
-      <w:r>
-        <w:t>Status: Available</w:t>
-      </w:r>
-    </w:p>
     <w:p/>
     <w:p/>
     <w:p>
       <w:r>
-        <w:t>Enter your choice: 4</w:t>
+        <w:lastRenderedPageBreak/>
+        <w:t>====================================</w:t>
+      </w:r>
+    </w:p>
+    <w:p>
+      <w:r>
+        <w:t xml:space="preserve">        PG MANAGEMENT SYSTEM</w:t>
+      </w:r>
+    </w:p>
+    <w:p>
+      <w:r>
+        <w:t>====================================</w:t>
       </w:r>
     </w:p>
     <w:p/>
     <w:p>
       <w:r>
-        <w:t>Enter Room ID to book: 101</w:t>
-      </w:r>
-    </w:p>
-    <w:p>
-      <w:r>
-        <w:t>Enter Check-in Date: 01-06-2026</w:t>
+        <w:t>1. Tenant Registration</w:t>
+      </w:r>
+    </w:p>
+    <w:p>
+      <w:r>
+        <w:t>2. Tenant Login</w:t>
+      </w:r>
+    </w:p>
+    <w:p>
+      <w:r>
+        <w:t>3. Admin Login</w:t>
+      </w:r>
+    </w:p>
+    <w:p>
+      <w:r>
+        <w:t>4. Exit</w:t>
       </w:r>
     </w:p>
     <w:p/>
     <w:p>
       <w:r>
-        <w:t>Room booked successfully.</w:t>
-      </w:r>
-    </w:p>
-    <w:p>
-      <w:r>
-        <w:t>Booking ID: B101</w:t>
+        <w:t>Enter your choice: 2</w:t>
+      </w:r>
+    </w:p>
+    <w:p/>
+    <w:p>
+      <w:r>
+        <w:t>----- Tenant Login -----</w:t>
+      </w:r>
+    </w:p>
+    <w:p>
+      <w:r>
+        <w:t>Enter Email: rahul@gmail.com</w:t>
+      </w:r>
+    </w:p>
+    <w:p>
+      <w:r>
+        <w:t>Enter Password: rahul123</w:t>
+      </w:r>
+    </w:p>
+    <w:p/>
+    <w:p>
+      <w:r>
+        <w:t>Login successful.</w:t>
+      </w:r>
+    </w:p>
+    <w:p>
+      <w:r>
+        <w:t>Welcome Rahul</w:t>
+      </w:r>
+    </w:p>
+    <w:p/>
+    <w:p>
+      <w:r>
+        <w:t>----------- Tenant Dashboard -----------</w:t>
+      </w:r>
+    </w:p>
+    <w:p/>
+    <w:p>
+      <w:r>
+        <w:t>1. View Profile</w:t>
+      </w:r>
+    </w:p>
+    <w:p>
+      <w:r>
+        <w:t>2. Update Profile</w:t>
+      </w:r>
+    </w:p>
+    <w:p>
+      <w:r>
+        <w:t>3. View Available Rooms</w:t>
+      </w:r>
+    </w:p>
+    <w:p>
+      <w:r>
+        <w:t>4. Book Room</w:t>
+      </w:r>
+    </w:p>
+    <w:p>
+      <w:r>
+        <w:t>5. View Booking Details</w:t>
+      </w:r>
+    </w:p>
+    <w:p>
+      <w:r>
+        <w:t>6. Cancel Booking</w:t>
+      </w:r>
+    </w:p>
+    <w:p>
+      <w:r>
+        <w:lastRenderedPageBreak/>
+        <w:t>7. Make Payment</w:t>
+      </w:r>
+    </w:p>
+    <w:p>
+      <w:r>
+        <w:t>8. Send Message to Admin</w:t>
+      </w:r>
+    </w:p>
+    <w:p>
+      <w:r>
+        <w:t>9. View Messages</w:t>
+      </w:r>
+    </w:p>
+    <w:p>
+      <w:r>
+        <w:t>10. Logout</w:t>
+      </w:r>
+    </w:p>
+    <w:p/>
+    <w:p>
+      <w:r>
+        <w:t>Enter your choice: 1</w:t>
+      </w:r>
+    </w:p>
+    <w:p/>
+    <w:p>
+      <w:r>
+        <w:t>----- Tenant Profile -----</w:t>
+      </w:r>
+    </w:p>
+    <w:p>
+      <w:r>
+        <w:t>Name: Rahul</w:t>
+      </w:r>
+    </w:p>
+    <w:p>
+      <w:r>
+        <w:t>Email: rahul@gmail.com</w:t>
+      </w:r>
+    </w:p>
+    <w:p>
+      <w:r>
+        <w:t>Phone: 9876543210</w:t>
       </w:r>
     </w:p>
     <w:p/>
     <w:p/>
     <w:p>
       <w:r>
-        <w:t>Enter your choice: 5</w:t>
+        <w:t>Enter your choice: 2</w:t>
       </w:r>
     </w:p>
     <w:p/>
     <w:p>
       <w:r>
-        <w:t>----- Booking Details -----</w:t>
+        <w:t>----- Update Profile -----</w:t>
+      </w:r>
+    </w:p>
+    <w:p>
+      <w:r>
+        <w:t>Enter new phone number: 9999999999</w:t>
+      </w:r>
+    </w:p>
+    <w:p>
+      <w:r>
+        <w:t>Enter new password: rahul456</w:t>
       </w:r>
     </w:p>
     <w:p/>
     <w:p>
       <w:r>
-        <w:t>Booking ID: B101</w:t>
-      </w:r>
-    </w:p>
-    <w:p>
-      <w:r>
-        <w:t>Tenant Name: Rahul</w:t>
-      </w:r>
-    </w:p>
-    <w:p>
-      <w:r>
-        <w:t>Room Number: 101</w:t>
-      </w:r>
-    </w:p>
-    <w:p>
-      <w:r>
-        <w:t>Room Type: Single</w:t>
-      </w:r>
-    </w:p>
-    <w:p>
-      <w:r>
-        <w:t>Rent: 5000</w:t>
-      </w:r>
-    </w:p>
-    <w:p>
-      <w:r>
-        <w:t>Status: Confirmed</w:t>
+        <w:t>Profile updated successfully.</w:t>
       </w:r>
     </w:p>
     <w:p/>
     <w:p/>
     <w:p>
       <w:r>
+        <w:t>Enter your choice: 3</w:t>
+      </w:r>
+    </w:p>
+    <w:p/>
+    <w:p>
+      <w:r>
+        <w:t>----- Available Rooms -----</w:t>
+      </w:r>
+    </w:p>
+    <w:p/>
+    <w:p>
+      <w:r>
         <w:lastRenderedPageBreak/>
-        <w:t>Enter your choice: 7</w:t>
+        <w:t>Room ID: 101</w:t>
+      </w:r>
+    </w:p>
+    <w:p>
+      <w:r>
+        <w:t>Room Type: Single</w:t>
+      </w:r>
+    </w:p>
+    <w:p>
+      <w:r>
+        <w:t>Rent: 5000</w:t>
+      </w:r>
+    </w:p>
+    <w:p>
+      <w:r>
+        <w:t>Status: Available</w:t>
       </w:r>
     </w:p>
     <w:p/>
     <w:p>
       <w:r>
-        <w:t>----- Rent Payment -----</w:t>
-      </w:r>
-    </w:p>
-    <w:p/>
-    <w:p>
-      <w:r>
-        <w:t>Enter Booking ID: B101</w:t>
-      </w:r>
-    </w:p>
-    <w:p>
-      <w:r>
-        <w:t>Enter Payment Amount: 5000</w:t>
-      </w:r>
-    </w:p>
-    <w:p/>
-    <w:p>
-      <w:r>
-        <w:t>Select Payment Method</w:t>
-      </w:r>
-    </w:p>
-    <w:p>
-      <w:r>
-        <w:t>1. UPI</w:t>
-      </w:r>
-    </w:p>
-    <w:p>
-      <w:r>
-        <w:t>2. Card</w:t>
-      </w:r>
-    </w:p>
-    <w:p>
-      <w:r>
-        <w:t>3. Cash</w:t>
-      </w:r>
-    </w:p>
-    <w:p/>
-    <w:p>
-      <w:r>
-        <w:t>Enter choice: 1</w:t>
-      </w:r>
-    </w:p>
-    <w:p/>
-    <w:p>
-      <w:r>
-        <w:t>Payment successful.</w:t>
-      </w:r>
-    </w:p>
-    <w:p/>
-    <w:p>
-      <w:r>
-        <w:t>Payment ID: P501</w:t>
-      </w:r>
-    </w:p>
-    <w:p>
-      <w:r>
-        <w:t>Amount Paid: 5000</w:t>
-      </w:r>
-    </w:p>
-    <w:p>
-      <w:r>
-        <w:t>Status: Paid</w:t>
-      </w:r>
-    </w:p>
-    <w:p/>
-    <w:p>
-      <w:r>
-        <w:t>----- Payment Receipt -----</w:t>
-      </w:r>
-    </w:p>
-    <w:p/>
-    <w:p>
-      <w:r>
-        <w:t>Tenant Name: Rahul</w:t>
-      </w:r>
-    </w:p>
-    <w:p>
-      <w:r>
-        <w:t>Room Number: 101</w:t>
-      </w:r>
-    </w:p>
-    <w:p>
-      <w:r>
-        <w:t>Amount Paid: 5000</w:t>
-      </w:r>
-    </w:p>
-    <w:p>
-      <w:r>
-        <w:t>Payment Date: 01-06-2026</w:t>
-      </w:r>
-    </w:p>
-    <w:p>
-      <w:r>
-        <w:lastRenderedPageBreak/>
-        <w:t>Payment Status: Successful</w:t>
+        <w:t>Room ID: 102</w:t>
+      </w:r>
+    </w:p>
+    <w:p>
+      <w:r>
+        <w:t>Room Type: Double</w:t>
+      </w:r>
+    </w:p>
+    <w:p>
+      <w:r>
+        <w:t>Rent: 3500</w:t>
+      </w:r>
+    </w:p>
+    <w:p>
+      <w:r>
+        <w:t>Status: Available</w:t>
       </w:r>
     </w:p>
     <w:p/>
     <w:p/>
     <w:p>
       <w:r>
-        <w:t>Enter your choice: 8</w:t>
+        <w:t>Enter your choice: 4</w:t>
       </w:r>
     </w:p>
     <w:p/>
     <w:p>
       <w:r>
-        <w:t>Enter message to admin:</w:t>
-      </w:r>
-    </w:p>
-    <w:p>
-      <w:r>
-        <w:t>Water supply issue in room 101</w:t>
+        <w:t>Enter Room ID to book: 101</w:t>
+      </w:r>
+    </w:p>
+    <w:p>
+      <w:r>
+        <w:t>Enter Check-in Date: 01-06-2026</w:t>
       </w:r>
     </w:p>
     <w:p/>
     <w:p>
       <w:r>
-        <w:t>Message sent successfully.</w:t>
+        <w:t>Room booked successfully.</w:t>
+      </w:r>
+    </w:p>
+    <w:p>
+      <w:r>
+        <w:t>Booking ID: B101</w:t>
       </w:r>
     </w:p>
     <w:p/>
     <w:p/>
     <w:p>
       <w:r>
-        <w:t>Enter your choice: 9</w:t>
+        <w:t>Enter your choice: 5</w:t>
       </w:r>
     </w:p>
     <w:p/>
     <w:p>
       <w:r>
-        <w:t>----- Messages -----</w:t>
+        <w:t>----- Booking Details -----</w:t>
       </w:r>
     </w:p>
     <w:p/>
     <w:p>
       <w:r>
-        <w:t>Tenant: Water supply issue in room 101</w:t>
-      </w:r>
-    </w:p>
-    <w:p>
-      <w:r>
-        <w:t>Admin: Issue received. We will fix it soon.</w:t>
+        <w:t>Booking ID: B101</w:t>
+      </w:r>
+    </w:p>
+    <w:p>
+      <w:r>
+        <w:t>Tenant Name: Rahul</w:t>
+      </w:r>
+    </w:p>
+    <w:p>
+      <w:r>
+        <w:lastRenderedPageBreak/>
+        <w:t>Room Number: 101</w:t>
+      </w:r>
+    </w:p>
+    <w:p>
+      <w:r>
+        <w:t>Room Type: Single</w:t>
+      </w:r>
+    </w:p>
+    <w:p>
+      <w:r>
+        <w:t>Rent: 5000</w:t>
+      </w:r>
+    </w:p>
+    <w:p>
+      <w:r>
+        <w:t>Status: Confirmed</w:t>
       </w:r>
     </w:p>
     <w:p/>
     <w:p/>
     <w:p>
       <w:r>
-        <w:t>Enter your choice: 10</w:t>
+        <w:t>Enter your choice: 7</w:t>
       </w:r>
     </w:p>
     <w:p/>
     <w:p>
       <w:r>
-        <w:t xml:space="preserve">Do you want to </w:t>
-      </w:r>
-      <w:proofErr w:type="gramStart"/>
-      <w:r>
-        <w:t>logout</w:t>
-      </w:r>
-      <w:proofErr w:type="gramEnd"/>
-      <w:r>
-        <w:t>? (Y/N): Y</w:t>
+        <w:t>----- Rent Payment -----</w:t>
       </w:r>
     </w:p>
     <w:p/>
     <w:p>
       <w:r>
-        <w:t>Logout successful.</w:t>
-      </w:r>
-    </w:p>
-    <w:p>
-      <w:r>
-        <w:t>Returning to main menu.</w:t>
+        <w:t>Enter Booking ID: B101</w:t>
+      </w:r>
+    </w:p>
+    <w:p>
+      <w:r>
+        <w:t>Enter Payment Amount: 5000</w:t>
       </w:r>
     </w:p>
     <w:p/>
     <w:p>
       <w:r>
+        <w:t>Select Payment Method</w:t>
+      </w:r>
+    </w:p>
+    <w:p>
+      <w:r>
+        <w:t>1. UPI</w:t>
+      </w:r>
+    </w:p>
+    <w:p>
+      <w:r>
+        <w:t>2. Card</w:t>
+      </w:r>
+    </w:p>
+    <w:p>
+      <w:r>
+        <w:t>3. Cash</w:t>
+      </w:r>
+    </w:p>
+    <w:p/>
+    <w:p>
+      <w:r>
+        <w:t>Enter choice: 1</w:t>
+      </w:r>
+    </w:p>
+    <w:p/>
+    <w:p>
+      <w:r>
+        <w:t>Payment successful.</w:t>
+      </w:r>
+    </w:p>
+    <w:p/>
+    <w:p>
+      <w:r>
+        <w:t>Payment ID: P501</w:t>
+      </w:r>
+    </w:p>
+    <w:p>
+      <w:r>
+        <w:t>Amount Paid: 5000</w:t>
+      </w:r>
+    </w:p>
+    <w:p>
+      <w:r>
+        <w:t>Status: Paid</w:t>
+      </w:r>
+    </w:p>
+    <w:p/>
+    <w:p>
+      <w:r>
         <w:lastRenderedPageBreak/>
-        <w:t>====================================</w:t>
-      </w:r>
-    </w:p>
-    <w:p>
-      <w:r>
-        <w:t xml:space="preserve">        PG MANAGEMENT SYSTEM</w:t>
-      </w:r>
-    </w:p>
-    <w:p>
-      <w:r>
-        <w:t>====================================</w:t>
+        <w:t>----- Payment Receipt -----</w:t>
       </w:r>
     </w:p>
     <w:p/>
     <w:p>
       <w:r>
-        <w:t>1. Tenant Registration</w:t>
-      </w:r>
-    </w:p>
-    <w:p>
-      <w:r>
-        <w:t>2. Tenant Login</w:t>
-      </w:r>
-    </w:p>
-    <w:p>
-      <w:r>
-        <w:t>3. Admin Login</w:t>
-      </w:r>
-    </w:p>
-    <w:p>
-      <w:r>
-        <w:t>4. Exit</w:t>
-      </w:r>
-    </w:p>
-    <w:p/>
-    <w:p>
-      <w:r>
-        <w:t>Enter your choice: 3</w:t>
-      </w:r>
-    </w:p>
-    <w:p/>
-    <w:p>
-      <w:r>
-        <w:t>----- Admin Login -----</w:t>
-      </w:r>
-    </w:p>
-    <w:p/>
-    <w:p>
-      <w:r>
-        <w:t>Enter Admin Email: admin@pg.com</w:t>
-      </w:r>
-    </w:p>
-    <w:p>
-      <w:r>
-        <w:t>Enter Password: admin123</w:t>
-      </w:r>
-    </w:p>
-    <w:p/>
-    <w:p>
-      <w:r>
-        <w:t xml:space="preserve">Admin login </w:t>
-      </w:r>
-      <w:proofErr w:type="gramStart"/>
-      <w:r>
-        <w:t>successful</w:t>
-      </w:r>
-      <w:proofErr w:type="gramEnd"/>
-      <w:r>
-        <w:t>.</w:t>
-      </w:r>
-    </w:p>
-    <w:p/>
-    <w:p>
-      <w:r>
-        <w:t>----------- Admin Dashboard -----------</w:t>
-      </w:r>
-    </w:p>
-    <w:p/>
-    <w:p>
-      <w:r>
-        <w:t>1. Add Property</w:t>
-      </w:r>
-    </w:p>
-    <w:p>
-      <w:r>
-        <w:t>2. Update Property</w:t>
-      </w:r>
-    </w:p>
-    <w:p>
-      <w:r>
-        <w:t>3. Add Room</w:t>
-      </w:r>
-    </w:p>
-    <w:p>
-      <w:r>
-        <w:t>4. Delete Room</w:t>
-      </w:r>
-    </w:p>
-    <w:p>
-      <w:r>
-        <w:t>5. View Booking Report</w:t>
-      </w:r>
-    </w:p>
-    <w:p>
-      <w:r>
-        <w:t>6. View Payment Report</w:t>
-      </w:r>
-    </w:p>
-    <w:p>
-      <w:r>
-        <w:lastRenderedPageBreak/>
-        <w:t>7. Verify Payment</w:t>
-      </w:r>
-    </w:p>
-    <w:p>
-      <w:r>
-        <w:t>8. View Messages</w:t>
-      </w:r>
-    </w:p>
-    <w:p>
-      <w:r>
-        <w:t>9. Logout</w:t>
-      </w:r>
-    </w:p>
-    <w:p/>
-    <w:p>
-      <w:r>
-        <w:t>Enter your choice: 1</w:t>
-      </w:r>
-    </w:p>
-    <w:p/>
-    <w:p>
-      <w:r>
-        <w:t>----- Add Property -----</w:t>
-      </w:r>
-    </w:p>
-    <w:p/>
-    <w:p>
-      <w:r>
-        <w:t>Enter Property Name: Green PG</w:t>
-      </w:r>
-    </w:p>
-    <w:p>
-      <w:r>
-        <w:t>Enter Location: Chennai</w:t>
-      </w:r>
-    </w:p>
-    <w:p>
-      <w:r>
-        <w:t>Enter Total Rooms: 20</w:t>
-      </w:r>
-    </w:p>
-    <w:p/>
-    <w:p>
-      <w:r>
-        <w:t>Property added successfully.</w:t>
+        <w:t>Tenant Name: Rahul</w:t>
+      </w:r>
+    </w:p>
+    <w:p>
+      <w:r>
+        <w:t>Room Number: 101</w:t>
+      </w:r>
+    </w:p>
+    <w:p>
+      <w:r>
+        <w:t>Amount Paid: 5000</w:t>
+      </w:r>
+    </w:p>
+    <w:p>
+      <w:r>
+        <w:t>Payment Date: 01-06-2026</w:t>
+      </w:r>
+    </w:p>
+    <w:p>
+      <w:r>
+        <w:t>Payment Status: Successful</w:t>
       </w:r>
     </w:p>
     <w:p/>
     <w:p/>
     <w:p>
       <w:r>
-        <w:t>Enter your choice: 3</w:t>
+        <w:t>Enter your choice: 8</w:t>
       </w:r>
     </w:p>
     <w:p/>
     <w:p>
       <w:r>
-        <w:t>----- Add Room -----</w:t>
+        <w:t>Enter message to admin:</w:t>
+      </w:r>
+    </w:p>
+    <w:p>
+      <w:r>
+        <w:t>Water supply issue in room 101</w:t>
       </w:r>
     </w:p>
     <w:p/>
     <w:p>
       <w:r>
-        <w:t>Enter Property ID: 1</w:t>
-      </w:r>
-    </w:p>
-    <w:p>
-      <w:r>
-        <w:t>Enter Room Number: 101</w:t>
-      </w:r>
-    </w:p>
-    <w:p>
-      <w:r>
-        <w:t>Enter Room Type: Single</w:t>
-      </w:r>
-    </w:p>
-    <w:p>
-      <w:r>
-        <w:t>Enter Rent Amount: 5000</w:t>
-      </w:r>
-    </w:p>
-    <w:p/>
-    <w:p>
-      <w:r>
-        <w:t>Room added successfully.</w:t>
+        <w:t>Message sent successfully.</w:t>
       </w:r>
     </w:p>
     <w:p/>
     <w:p/>
     <w:p>
       <w:r>
-        <w:t>Enter your choice: 5</w:t>
+        <w:t>Enter your choice: 9</w:t>
       </w:r>
     </w:p>
     <w:p/>
     <w:p>
       <w:r>
-        <w:t>----- Booking Report -----</w:t>
+        <w:t>----- Messages -----</w:t>
       </w:r>
     </w:p>
     <w:p/>
     <w:p>
       <w:r>
-        <w:t>Total Bookings: 5</w:t>
-      </w:r>
-    </w:p>
-    <w:p>
-      <w:r>
-        <w:t>Active Bookings: 3</w:t>
-      </w:r>
-    </w:p>
-    <w:p>
-      <w:r>
-        <w:t>Cancelled Bookings: 2</w:t>
+        <w:t>Tenant: Water supply issue in room 101</w:t>
+      </w:r>
+    </w:p>
+    <w:p>
+      <w:r>
+        <w:t>Admin: Issue received. We will fix it soon.</w:t>
       </w:r>
     </w:p>
     <w:p/>
     <w:p/>
     <w:p>
       <w:r>
-        <w:t>Enter your choice: 6</w:t>
+        <w:t>Enter your choice: 10</w:t>
       </w:r>
     </w:p>
     <w:p/>
     <w:p>
       <w:r>
-        <w:t>----- Payment Report -----</w:t>
+        <w:t xml:space="preserve">Do you want to </w:t>
+      </w:r>
+      <w:proofErr w:type="gramStart"/>
+      <w:r>
+        <w:t>logout</w:t>
+      </w:r>
+      <w:proofErr w:type="gramEnd"/>
+      <w:r>
+        <w:t>? (Y/N): Y</w:t>
       </w:r>
     </w:p>
     <w:p/>
     <w:p>
       <w:r>
-        <w:t>Total Payments: 3</w:t>
-      </w:r>
-    </w:p>
-    <w:p>
-      <w:r>
-        <w:t>Total Amount Collected: 15000</w:t>
-      </w:r>
-    </w:p>
-    <w:p>
-      <w:r>
-        <w:t>Pending Payments: 1</w:t>
+        <w:t>Logout successful.</w:t>
+      </w:r>
+    </w:p>
+    <w:p>
+      <w:r>
+        <w:t>Returning to main menu.</w:t>
+      </w:r>
+    </w:p>
+    <w:p/>
+    <w:p>
+      <w:r>
+        <w:t>====================================</w:t>
+      </w:r>
+    </w:p>
+    <w:p>
+      <w:r>
+        <w:t xml:space="preserve">        PG MANAGEMENT SYSTEM</w:t>
+      </w:r>
+    </w:p>
+    <w:p>
+      <w:r>
+        <w:t>====================================</w:t>
+      </w:r>
+    </w:p>
+    <w:p/>
+    <w:p>
+      <w:r>
+        <w:t>1. Tenant Registration</w:t>
+      </w:r>
+    </w:p>
+    <w:p>
+      <w:r>
+        <w:t>2. Tenant Login</w:t>
+      </w:r>
+    </w:p>
+    <w:p>
+      <w:r>
+        <w:t>3. Admin Login</w:t>
+      </w:r>
+    </w:p>
+    <w:p>
+      <w:r>
+        <w:t>4. Exit</w:t>
+      </w:r>
+    </w:p>
+    <w:p/>
+    <w:p>
+      <w:r>
+        <w:t>Enter your choice: 3</w:t>
+      </w:r>
+    </w:p>
+    <w:p/>
+    <w:p>
+      <w:r>
+        <w:t>----- Admin Login -----</w:t>
+      </w:r>
+    </w:p>
+    <w:p/>
+    <w:p>
+      <w:r>
+        <w:t>Enter Admin Email: admin@pg.com</w:t>
+      </w:r>
+    </w:p>
+    <w:p>
+      <w:r>
+        <w:t>Enter Password: admin123</w:t>
+      </w:r>
+    </w:p>
+    <w:p/>
+    <w:p>
+      <w:r>
+        <w:t xml:space="preserve">Admin login </w:t>
+      </w:r>
+      <w:proofErr w:type="gramStart"/>
+      <w:r>
+        <w:t>successful</w:t>
+      </w:r>
+      <w:proofErr w:type="gramEnd"/>
+      <w:r>
+        <w:t>.</w:t>
+      </w:r>
+    </w:p>
+    <w:p/>
+    <w:p>
+      <w:r>
+        <w:t>----------- Admin Dashboard -----------</w:t>
+      </w:r>
+    </w:p>
+    <w:p/>
+    <w:p>
+      <w:r>
+        <w:lastRenderedPageBreak/>
+        <w:t>1. Add Property</w:t>
+      </w:r>
+    </w:p>
+    <w:p>
+      <w:r>
+        <w:t>2. Update Property</w:t>
+      </w:r>
+    </w:p>
+    <w:p>
+      <w:r>
+        <w:t>3. Add Room</w:t>
+      </w:r>
+    </w:p>
+    <w:p>
+      <w:r>
+        <w:t>4. Delete Room</w:t>
+      </w:r>
+    </w:p>
+    <w:p>
+      <w:r>
+        <w:t>5. View Booking Report</w:t>
+      </w:r>
+    </w:p>
+    <w:p>
+      <w:r>
+        <w:t>6. View Payment Report</w:t>
+      </w:r>
+    </w:p>
+    <w:p>
+      <w:r>
+        <w:t>7. Verify Payment</w:t>
+      </w:r>
+    </w:p>
+    <w:p>
+      <w:r>
+        <w:t>8. View Messages</w:t>
+      </w:r>
+    </w:p>
+    <w:p>
+      <w:r>
+        <w:t>9. Logout</w:t>
+      </w:r>
+    </w:p>
+    <w:p/>
+    <w:p>
+      <w:r>
+        <w:t>Enter your choice: 1</w:t>
+      </w:r>
+    </w:p>
+    <w:p/>
+    <w:p>
+      <w:r>
+        <w:t>----- Add Property -----</w:t>
+      </w:r>
+    </w:p>
+    <w:p/>
+    <w:p>
+      <w:r>
+        <w:t>Enter Property Name: Green PG</w:t>
+      </w:r>
+    </w:p>
+    <w:p>
+      <w:r>
+        <w:t>Enter Location: Chennai</w:t>
+      </w:r>
+    </w:p>
+    <w:p>
+      <w:r>
+        <w:t>Enter Total Rooms: 20</w:t>
+      </w:r>
+    </w:p>
+    <w:p/>
+    <w:p>
+      <w:r>
+        <w:t>Property added successfully.</w:t>
       </w:r>
     </w:p>
     <w:p/>
     <w:p/>
     <w:p>
       <w:r>
-        <w:t>Enter your choice: 7</w:t>
+        <w:t>Enter your choice: 3</w:t>
       </w:r>
     </w:p>
     <w:p/>
     <w:p>
       <w:r>
-        <w:t>Payment ID: P501</w:t>
-      </w:r>
-    </w:p>
-    <w:p>
-      <w:r>
-        <w:t>Tenant: Rahul</w:t>
-      </w:r>
-    </w:p>
-    <w:p>
-      <w:r>
-        <w:t>Amount: 5000</w:t>
-      </w:r>
-    </w:p>
-    <w:p>
-      <w:r>
-        <w:t>Status: Pending</w:t>
+        <w:t>----- Add Room -----</w:t>
       </w:r>
     </w:p>
     <w:p/>
     <w:p>
       <w:r>
+        <w:t>Enter Property ID: 1</w:t>
+      </w:r>
+    </w:p>
+    <w:p>
+      <w:r>
         <w:lastRenderedPageBreak/>
-        <w:t>Verify payment? (Y/N): Y</w:t>
+        <w:t>Enter Room Number: 101</w:t>
+      </w:r>
+    </w:p>
+    <w:p>
+      <w:r>
+        <w:t>Enter Room Type: Single</w:t>
+      </w:r>
+    </w:p>
+    <w:p>
+      <w:r>
+        <w:t>Enter Rent Amount: 5000</w:t>
       </w:r>
     </w:p>
     <w:p/>
     <w:p>
       <w:r>
-        <w:t>Payment verified successfully.</w:t>
+        <w:t>Room added successfully.</w:t>
       </w:r>
     </w:p>
     <w:p/>
     <w:p/>
     <w:p>
       <w:r>
-        <w:t>Enter your choice: 9</w:t>
+        <w:t>Enter your choice: 5</w:t>
       </w:r>
     </w:p>
     <w:p/>
     <w:p>
       <w:r>
-        <w:t>Admin logged out successfully.</w:t>
-      </w:r>
-    </w:p>
-    <w:p>
-      <w:r>
-        <w:t>Returning to main menu.</w:t>
+        <w:t>----- Booking Report -----</w:t>
+      </w:r>
+    </w:p>
+    <w:p/>
+    <w:p>
+      <w:r>
+        <w:t>Total Bookings: 5</w:t>
+      </w:r>
+    </w:p>
+    <w:p>
+      <w:r>
+        <w:t>Active Bookings: 3</w:t>
+      </w:r>
+    </w:p>
+    <w:p>
+      <w:r>
+        <w:t>Cancelled Bookings: 2</w:t>
       </w:r>
     </w:p>
     <w:p/>
     <w:p/>
     <w:p>
       <w:r>
+        <w:t>Enter your choice: 6</w:t>
+      </w:r>
+    </w:p>
+    <w:p/>
+    <w:p>
+      <w:r>
+        <w:t>----- Payment Report -----</w:t>
+      </w:r>
+    </w:p>
+    <w:p/>
+    <w:p>
+      <w:r>
+        <w:t>Total Payments: 3</w:t>
+      </w:r>
+    </w:p>
+    <w:p>
+      <w:r>
+        <w:t>Total Amount Collected: 15000</w:t>
+      </w:r>
+    </w:p>
+    <w:p>
+      <w:r>
+        <w:t>Pending Payments: 1</w:t>
+      </w:r>
+    </w:p>
+    <w:p/>
+    <w:p/>
+    <w:p>
+      <w:r>
+        <w:t>Enter your choice: 7</w:t>
+      </w:r>
+    </w:p>
+    <w:p/>
+    <w:p>
+      <w:r>
+        <w:t>Payment ID: P501</w:t>
+      </w:r>
+    </w:p>
+    <w:p>
+      <w:r>
+        <w:t>Tenant: Rahul</w:t>
+      </w:r>
+    </w:p>
+    <w:p>
+      <w:r>
+        <w:t>Amount: 5000</w:t>
+      </w:r>
+    </w:p>
+    <w:p>
+      <w:r>
+        <w:t>Status: Pending</w:t>
+      </w:r>
+    </w:p>
+    <w:p/>
+    <w:p>
+      <w:r>
+        <w:t>Verify payment? (Y/N): Y</w:t>
+      </w:r>
+    </w:p>
+    <w:p/>
+    <w:p>
+      <w:r>
+        <w:t>Payment verified successfully.</w:t>
+      </w:r>
+    </w:p>
+    <w:p/>
+    <w:p/>
+    <w:p>
+      <w:r>
+        <w:t>Enter your choice: 9</w:t>
+      </w:r>
+    </w:p>
+    <w:p/>
+    <w:p>
+      <w:r>
+        <w:t>Admin logged out successfully.</w:t>
+      </w:r>
+    </w:p>
+    <w:p>
+      <w:r>
+        <w:t>Returning to main menu.</w:t>
+      </w:r>
+    </w:p>
+    <w:p/>
+    <w:p/>
+    <w:p>
+      <w:r>
         <w:t>====================================</w:t>
       </w:r>
     </w:p>
@@ -949,6 +955,7 @@
     <w:p/>
     <w:p>
       <w:r>
+        <w:lastRenderedPageBreak/>
         <w:t>Enter your choice: 4</w:t>
       </w:r>
     </w:p>

</xml_diff>